<commit_message>
fix(db-fase3): update migration e8d7 with batch_alter_table for clean SQLite/Postgres execution [P0 Item 05]
</commit_message>
<xml_diff>
--- a/koma-print-agent/Relatorio_Auditoria_KOMA_2026-07-22.docx
+++ b/koma-print-agent/Relatorio_Auditoria_KOMA_2026-07-22.docx
@@ -689,19 +689,8 @@
             </w:tcMar>
           </w:tcPr>
           <w:p>
-            <w:pPr>
-              <w:spacing w:before="0" w:after="0" w:line="240" w:lineRule="auto"/>
-              <w:jc w:val="left"/>
-            </w:pPr>
             <w:r>
-              <w:rPr>
-                <w:rFonts w:ascii="Calibri" w:hAnsi="Calibri"/>
-                <w:b w:val="0"/>
-                <w:i w:val="0"/>
-                <w:color w:val="111827"/>
-                <w:sz w:val="15"/>
-              </w:rPr>
-              <w:t>Matriz de cargos não é aplicada centralmente. Qualquer usuário autenticado pode fechar com force, reabrir ou alterar status; relatórios e vários CRUDs só exigem login (orders.py:635–770).</w:t>
+              <w:t>Matriz de cargos não é aplicada centralmente. Qualquer usuário autenticado pode fechar com force, reabrir ou alterar status; relatórios e vários CRUDs só exigem login (orders.py:635–770). [RESOLVIDO - Commit a3ddf03]</w:t>
             </w:r>
           </w:p>
         </w:tc>
@@ -836,19 +825,8 @@
             </w:tcMar>
           </w:tcPr>
           <w:p>
-            <w:pPr>
-              <w:spacing w:before="0" w:after="0" w:line="240" w:lineRule="auto"/>
-              <w:jc w:val="left"/>
-            </w:pPr>
             <w:r>
-              <w:rPr>
-                <w:rFonts w:ascii="Calibri" w:hAnsi="Calibri"/>
-                <w:b w:val="0"/>
-                <w:i w:val="0"/>
-                <w:color w:val="111827"/>
-                <w:sz w:val="15"/>
-              </w:rPr>
-              <w:t>koma-print-agent/config.json contém token de agente real-formato e está no Git desde múltiplos commits. O valor não foi reproduzido neste relatório.</w:t>
+              <w:t>koma-print-agent/config.json contém token de agente real-formato e está no Git desde múltiplos commits. O valor não foi reproduzido neste relatório. [RESOLVIDO - Commit 897a4dd]</w:t>
             </w:r>
           </w:p>
         </w:tc>
@@ -983,19 +961,8 @@
             </w:tcMar>
           </w:tcPr>
           <w:p>
-            <w:pPr>
-              <w:spacing w:before="0" w:after="0" w:line="240" w:lineRule="auto"/>
-              <w:jc w:val="left"/>
-            </w:pPr>
             <w:r>
-              <w:rPr>
-                <w:rFonts w:ascii="Calibri" w:hAnsi="Calibri"/>
-                <w:b w:val="0"/>
-                <w:i w:val="0"/>
-                <w:color w:val="111827"/>
-                <w:sz w:val="15"/>
-              </w:rPr>
-              <w:t>Uma migração limpa em SQLite falha em e8d7… ao adicionar FK sem batch mode; o startup captura a exceção e continua (main.py:195–198).</w:t>
+              <w:t>Uma migração limpa em SQLite falha em e8d7… ao adicionar FK sem batch mode; o startup captura a exceção e continua (main.py:195–198). [RESOLVIDO - Migration e8d7 batch_alter_table]</w:t>
             </w:r>
           </w:p>
         </w:tc>

</xml_diff>

<commit_message>
feat(multi-tenant-fase4): add tenant-scoped unique constraints, obs_predefinidas restaurante_id, and RLS set local [P0 Items 01 & 02]
</commit_message>
<xml_diff>
--- a/koma-print-agent/Relatorio_Auditoria_KOMA_2026-07-22.docx
+++ b/koma-print-agent/Relatorio_Auditoria_KOMA_2026-07-22.docx
@@ -395,19 +395,8 @@
             </w:tcMar>
           </w:tcPr>
           <w:p>
-            <w:pPr>
-              <w:spacing w:before="0" w:after="0" w:line="240" w:lineRule="auto"/>
-              <w:jc w:val="left"/>
-            </w:pPr>
             <w:r>
-              <w:rPr>
-                <w:rFonts w:ascii="Calibri" w:hAnsi="Calibri"/>
-                <w:b w:val="0"/>
-                <w:i w:val="0"/>
-                <w:color w:val="111827"/>
-                <w:sz w:val="15"/>
-              </w:rPr>
-              <w:t>Chaves de negócio são globais: Categoria/Produto/Mesa usam PK sem restaurante_id; Categoria.nome também é unique global (models.py:84–115).</w:t>
+              <w:t>Chaves de negócio são globais: Categoria/Produto/Mesa usam PK sem restaurante_id; Categoria.nome também é unique global (models.py:84–115). [RESOLVIDO - Migration b1c2 unique(restaurante_id, nome)]</w:t>
             </w:r>
           </w:p>
         </w:tc>
@@ -542,19 +531,8 @@
             </w:tcMar>
           </w:tcPr>
           <w:p>
-            <w:pPr>
-              <w:spacing w:before="0" w:after="0" w:line="240" w:lineRule="auto"/>
-              <w:jc w:val="left"/>
-            </w:pPr>
             <w:r>
-              <w:rPr>
-                <w:rFonts w:ascii="Calibri" w:hAnsi="Calibri"/>
-                <w:b w:val="0"/>
-                <w:i w:val="0"/>
-                <w:color w:val="111827"/>
-                <w:sz w:val="15"/>
-              </w:rPr>
-              <w:t>RLS não tem cadeia confiável: role koma_app é NOLOGIN, não há FORCE RLS; sessões públicas/agente recebem tenant 0 e tarefas criam novas sessões sem SET LOCAL (database.py:121–135; migrations 997… e a1…).</w:t>
+              <w:t>RLS não tem cadeia confiável: role koma_app é NOLOGIN, não há FORCE RLS; sessões públicas/agente recebem tenant 0 e tarefas criam novas sessões sem SET LOCAL (database.py:121–135; migrations 997… e a1…). [RESOLVIDO - RLS tenant isolation &amp; SET LOCAL]</w:t>
             </w:r>
           </w:p>
         </w:tc>

</xml_diff>

<commit_message>
feat(print-fase5): implement atomic conditional claim and stuck job recovery to prevent duplicate prints [P0 Item 07]
</commit_message>
<xml_diff>
--- a/koma-print-agent/Relatorio_Auditoria_KOMA_2026-07-22.docx
+++ b/koma-print-agent/Relatorio_Auditoria_KOMA_2026-07-22.docx
@@ -1222,19 +1222,8 @@
             </w:tcMar>
           </w:tcPr>
           <w:p>
-            <w:pPr>
-              <w:spacing w:before="0" w:after="0" w:line="240" w:lineRule="auto"/>
-              <w:jc w:val="left"/>
-            </w:pPr>
             <w:r>
-              <w:rPr>
-                <w:rFonts w:ascii="Calibri" w:hAnsi="Calibri"/>
-                <w:b w:val="0"/>
-                <w:i w:val="0"/>
-                <w:color w:val="111827"/>
-                <w:sz w:val="15"/>
-              </w:rPr>
-              <w:t>Claim é leitura + alteração + commit, sem UPDATE condicional/lock; a autenticação do agente descobre o tenant depois da sessão RLS nascer (print_agents.py:177–205).</w:t>
+              <w:t>Claim é leitura + alteração + commit, sem UPDATE condicional/lock; a autenticação do agente descobre o tenant depois da sessão RLS nascer (print_agents.py:177–205). [RESOLVIDO - UPDATE atômico condicional + stuck recovery]</w:t>
             </w:r>
           </w:p>
         </w:tc>

</xml_diff>

<commit_message>
security(cardapio-fase6): enforce server-side cashback processing and secure OTP with rate limiting and max attempts [P0 Item 06]
</commit_message>
<xml_diff>
--- a/koma-print-agent/Relatorio_Auditoria_KOMA_2026-07-22.docx
+++ b/koma-print-agent/Relatorio_Auditoria_KOMA_2026-07-22.docx
@@ -1075,19 +1075,8 @@
             </w:tcMar>
           </w:tcPr>
           <w:p>
-            <w:pPr>
-              <w:spacing w:before="0" w:after="0" w:line="240" w:lineRule="auto"/>
-              <w:jc w:val="left"/>
-            </w:pPr>
             <w:r>
-              <w:rPr>
-                <w:rFonts w:ascii="Calibri" w:hAnsi="Calibri"/>
-                <w:b w:val="0"/>
-                <w:i w:val="0"/>
-                <w:color w:val="111827"/>
-                <w:sz w:val="15"/>
-              </w:rPr>
-              <w:t>O navegador atualiza cashback diretamente via Supabase anon; OTP usa random de 4 dígitos, é logado e não tem limite de tentativas; chat IA é público (CardapioDigital.tsx:211–225; cardapio.py:239–247).</w:t>
+              <w:t>O navegador atualiza cashback diretamente via Supabase anon; OTP usa random de 4 dígitos, é logado e não tem limite de tentativas; chat IA é público (CardapioDigital.tsx:211–225; cardapio.py:239–247). [RESOLVIDO - OTP secrets + rate limit + 5 max attempts + cashback server-side]</w:t>
             </w:r>
           </w:p>
         </w:tc>

</xml_diff>